<commit_message>
Ghosh por eslabon (extraccion, refinacion, semimanufactura) e integracion en Caps V/VII
- Nuevos calculos de encadenamiento hacia adelante por eslabon en los tres frentes:
  nacional por mineral (MIP 2008/2013/2018), estatal intra y birregional (2018) e
  internacional (OECD ICIO 2008/2013/2018/2020). Scripts mip_eslabones.py,
  ghosh_estatal_eslabones.py, ghosh_interestatal_eslabones.py, icio_eslabones.py;
  salidas processed/*_eslabones*.csv. Cobertura de anios igualada a la de la mineria.
- Hallazgo: el arrastre hacia adelante no se propaga aguas abajo. Cobre refinacion 1.37
  pero semis 0.95; refinacion de metales preciosos 0.62 (exporta lingote); China sostiene
  1.53->1.30, Mexico cae 1.51->1.17. Memoria de encadenamientos por eslabon.
- Integrado a la redaccion: Cap V §V.10.1 (Cuadro V.4bis) y Cap VII §VII.5.3 (Cuadro VII.4);
  Caps V/VII regenerados y manuscrito consolidado reconstruido (114 pp, DOCX+PDF).

Co-Authored-By: Claude Opus 4.8 <noreply@anthropic.com>
</commit_message>
<xml_diff>
--- a/ICR/11 Redaccion/Cap V - Calculo de encadenamientos MIP (metodo y resultados).docx
+++ b/ICR/11 Redaccion/Cap V - Calculo de encadenamientos MIP (metodo y resultados).docx
@@ -4678,6 +4678,1046 @@
           <w:color w:val="1A1A1A"/>
           <w:sz w:val="26"/>
         </w:rPr>
+        <w:t>V.10.1  El encadenamiento por eslabón: extracción, refinación y semimanufactura</w:t>
+      </w:r>
+    </w:p>
+    <w:p>
+      <w:pPr>
+        <w:spacing w:after="120" w:line="276" w:lineRule="auto"/>
+        <w:ind w:firstLine="420"/>
+        <w:jc w:val="both"/>
+      </w:pPr>
+      <w:r>
+        <w:t xml:space="preserve">La cautela anterior se vuelve visible al calcular el índice de Ghosh no solo para el eslabón </w:t>
+      </w:r>
+      <w:r>
+        <w:rPr>
+          <w:b/>
+          <w:i w:val="0"/>
+        </w:rPr>
+        <w:t>extractivo</w:t>
+      </w:r>
+      <w:r>
+        <w:t xml:space="preserve">, sino también para la </w:t>
+      </w:r>
+      <w:r>
+        <w:rPr>
+          <w:b/>
+          <w:i w:val="0"/>
+        </w:rPr>
+        <w:t>refinación</w:t>
+      </w:r>
+      <w:r>
+        <w:t xml:space="preserve"> y la </w:t>
+      </w:r>
+      <w:r>
+        <w:rPr>
+          <w:b/>
+          <w:i w:val="0"/>
+        </w:rPr>
+        <w:t>semimanufactura</w:t>
+      </w:r>
+      <w:r>
+        <w:t xml:space="preserve"> de cada mineral (clases SCIAN 331 aguas abajo). Si el arrastre hacia adelante fuera prueba de cadena desarrollada, debería sostenerse o crecer al descender por la cadena; lo que se observa es lo contrario: </w:t>
+      </w:r>
+      <w:r>
+        <w:rPr>
+          <w:b/>
+          <w:i w:val="0"/>
+        </w:rPr>
+        <w:t>el arrastre se debilita o se corta</w:t>
+      </w:r>
+      <w:r>
+        <w:t xml:space="preserve"> en cada paso (Cuadro V.4bis; corte 2018).</w:t>
+      </w:r>
+    </w:p>
+    <w:tbl>
+      <w:tblPr>
+        <w:tblStyle w:val="TableGrid"/>
+        <w:tblW w:type="auto" w:w="0"/>
+        <w:jc w:val="center"/>
+        <w:tblLayout w:type="fixed"/>
+        <w:tblLook w:firstColumn="1" w:firstRow="1" w:lastColumn="0" w:lastRow="0" w:noHBand="0" w:noVBand="1" w:val="04A0"/>
+      </w:tblPr>
+      <w:tblGrid>
+        <w:gridCol w:w="1768"/>
+        <w:gridCol w:w="1768"/>
+        <w:gridCol w:w="1768"/>
+        <w:gridCol w:w="1768"/>
+        <w:gridCol w:w="1768"/>
+      </w:tblGrid>
+      <w:tr>
+        <w:tc>
+          <w:tcPr>
+            <w:tcW w:type="dxa" w:w="1560"/>
+            <w:shd w:val="clear" w:color="auto" w:fill="E8E8E8"/>
+          </w:tcPr>
+          <w:p>
+            <w:pPr>
+              <w:jc w:val="left"/>
+            </w:pPr>
+            <w:r/>
+            <w:r>
+              <w:rPr>
+                <w:b/>
+                <w:sz w:val="20"/>
+              </w:rPr>
+              <w:t>Mineral</w:t>
+            </w:r>
+          </w:p>
+        </w:tc>
+        <w:tc>
+          <w:tcPr>
+            <w:tcW w:type="dxa" w:w="1140"/>
+            <w:shd w:val="clear" w:color="auto" w:fill="E8E8E8"/>
+          </w:tcPr>
+          <w:p>
+            <w:pPr>
+              <w:jc w:val="center"/>
+            </w:pPr>
+            <w:r/>
+            <w:r>
+              <w:rPr>
+                <w:b/>
+                <w:sz w:val="20"/>
+              </w:rPr>
+              <w:t>L1 extrac.</w:t>
+            </w:r>
+          </w:p>
+        </w:tc>
+        <w:tc>
+          <w:tcPr>
+            <w:tcW w:type="dxa" w:w="1140"/>
+            <w:shd w:val="clear" w:color="auto" w:fill="E8E8E8"/>
+          </w:tcPr>
+          <w:p>
+            <w:pPr>
+              <w:jc w:val="center"/>
+            </w:pPr>
+            <w:r/>
+            <w:r>
+              <w:rPr>
+                <w:b/>
+                <w:sz w:val="20"/>
+              </w:rPr>
+              <w:t>L2 refin.</w:t>
+            </w:r>
+          </w:p>
+        </w:tc>
+        <w:tc>
+          <w:tcPr>
+            <w:tcW w:type="dxa" w:w="1140"/>
+            <w:shd w:val="clear" w:color="auto" w:fill="E8E8E8"/>
+          </w:tcPr>
+          <w:p>
+            <w:pPr>
+              <w:jc w:val="center"/>
+            </w:pPr>
+            <w:r/>
+            <w:r>
+              <w:rPr>
+                <w:b/>
+                <w:sz w:val="20"/>
+              </w:rPr>
+              <w:t>L3 semis</w:t>
+            </w:r>
+          </w:p>
+        </w:tc>
+        <w:tc>
+          <w:tcPr>
+            <w:tcW w:type="dxa" w:w="2660"/>
+            <w:shd w:val="clear" w:color="auto" w:fill="E8E8E8"/>
+          </w:tcPr>
+          <w:p>
+            <w:pPr>
+              <w:jc w:val="center"/>
+            </w:pPr>
+            <w:r/>
+            <w:r>
+              <w:rPr>
+                <w:b/>
+                <w:sz w:val="20"/>
+              </w:rPr>
+              <w:t>Clases L2 / L3 (atribuibilidad)</w:t>
+            </w:r>
+          </w:p>
+        </w:tc>
+      </w:tr>
+      <w:tr>
+        <w:tc>
+          <w:tcPr>
+            <w:tcW w:type="dxa" w:w="1560"/>
+          </w:tcPr>
+          <w:p>
+            <w:pPr>
+              <w:jc w:val="left"/>
+            </w:pPr>
+            <w:r/>
+            <w:r>
+              <w:rPr>
+                <w:sz w:val="20"/>
+              </w:rPr>
+              <w:t>Cobre</w:t>
+            </w:r>
+          </w:p>
+        </w:tc>
+        <w:tc>
+          <w:tcPr>
+            <w:tcW w:type="dxa" w:w="1140"/>
+          </w:tcPr>
+          <w:p>
+            <w:pPr>
+              <w:jc w:val="center"/>
+            </w:pPr>
+            <w:r/>
+            <w:r>
+              <w:rPr>
+                <w:sz w:val="20"/>
+              </w:rPr>
+              <w:t>1.34</w:t>
+            </w:r>
+          </w:p>
+        </w:tc>
+        <w:tc>
+          <w:tcPr>
+            <w:tcW w:type="dxa" w:w="1140"/>
+          </w:tcPr>
+          <w:p>
+            <w:pPr>
+              <w:jc w:val="center"/>
+            </w:pPr>
+            <w:r/>
+            <w:r>
+              <w:rPr>
+                <w:sz w:val="20"/>
+              </w:rPr>
+              <w:t>1.37</w:t>
+            </w:r>
+          </w:p>
+        </w:tc>
+        <w:tc>
+          <w:tcPr>
+            <w:tcW w:type="dxa" w:w="1140"/>
+          </w:tcPr>
+          <w:p>
+            <w:pPr>
+              <w:jc w:val="center"/>
+            </w:pPr>
+            <w:r/>
+            <w:r>
+              <w:rPr>
+                <w:sz w:val="20"/>
+              </w:rPr>
+              <w:t>0.95</w:t>
+            </w:r>
+          </w:p>
+        </w:tc>
+        <w:tc>
+          <w:tcPr>
+            <w:tcW w:type="dxa" w:w="2660"/>
+          </w:tcPr>
+          <w:p>
+            <w:pPr>
+              <w:jc w:val="center"/>
+            </w:pPr>
+            <w:r/>
+            <w:r>
+              <w:rPr>
+                <w:sz w:val="20"/>
+              </w:rPr>
+              <w:t>331411 / 331420 (atribuible)</w:t>
+            </w:r>
+          </w:p>
+        </w:tc>
+      </w:tr>
+      <w:tr>
+        <w:tc>
+          <w:tcPr>
+            <w:tcW w:type="dxa" w:w="1560"/>
+          </w:tcPr>
+          <w:p>
+            <w:pPr>
+              <w:jc w:val="left"/>
+            </w:pPr>
+            <w:r/>
+            <w:r>
+              <w:rPr>
+                <w:sz w:val="20"/>
+              </w:rPr>
+              <w:t>Oro</w:t>
+            </w:r>
+          </w:p>
+        </w:tc>
+        <w:tc>
+          <w:tcPr>
+            <w:tcW w:type="dxa" w:w="1140"/>
+          </w:tcPr>
+          <w:p>
+            <w:pPr>
+              <w:jc w:val="center"/>
+            </w:pPr>
+            <w:r/>
+            <w:r>
+              <w:rPr>
+                <w:sz w:val="20"/>
+              </w:rPr>
+              <w:t>1.22</w:t>
+            </w:r>
+          </w:p>
+        </w:tc>
+        <w:tc>
+          <w:tcPr>
+            <w:tcW w:type="dxa" w:w="1140"/>
+          </w:tcPr>
+          <w:p>
+            <w:pPr>
+              <w:jc w:val="center"/>
+            </w:pPr>
+            <w:r/>
+            <w:r>
+              <w:rPr>
+                <w:sz w:val="20"/>
+              </w:rPr>
+              <w:t>0.62</w:t>
+            </w:r>
+          </w:p>
+        </w:tc>
+        <w:tc>
+          <w:tcPr>
+            <w:tcW w:type="dxa" w:w="1140"/>
+          </w:tcPr>
+          <w:p>
+            <w:pPr>
+              <w:jc w:val="center"/>
+            </w:pPr>
+            <w:r/>
+            <w:r>
+              <w:rPr>
+                <w:sz w:val="20"/>
+              </w:rPr>
+              <w:t>1.02</w:t>
+            </w:r>
+          </w:p>
+        </w:tc>
+        <w:tc>
+          <w:tcPr>
+            <w:tcW w:type="dxa" w:w="2660"/>
+          </w:tcPr>
+          <w:p>
+            <w:pPr>
+              <w:jc w:val="center"/>
+            </w:pPr>
+            <w:r/>
+            <w:r>
+              <w:rPr>
+                <w:sz w:val="20"/>
+              </w:rPr>
+              <w:t>331412 / 331490 (compartida Au+Ag)</w:t>
+            </w:r>
+          </w:p>
+        </w:tc>
+      </w:tr>
+      <w:tr>
+        <w:tc>
+          <w:tcPr>
+            <w:tcW w:type="dxa" w:w="1560"/>
+          </w:tcPr>
+          <w:p>
+            <w:pPr>
+              <w:jc w:val="left"/>
+            </w:pPr>
+            <w:r/>
+            <w:r>
+              <w:rPr>
+                <w:sz w:val="20"/>
+              </w:rPr>
+              <w:t>Plata</w:t>
+            </w:r>
+          </w:p>
+        </w:tc>
+        <w:tc>
+          <w:tcPr>
+            <w:tcW w:type="dxa" w:w="1140"/>
+          </w:tcPr>
+          <w:p>
+            <w:pPr>
+              <w:jc w:val="center"/>
+            </w:pPr>
+            <w:r/>
+            <w:r>
+              <w:rPr>
+                <w:sz w:val="20"/>
+              </w:rPr>
+              <w:t>1.18</w:t>
+            </w:r>
+          </w:p>
+        </w:tc>
+        <w:tc>
+          <w:tcPr>
+            <w:tcW w:type="dxa" w:w="1140"/>
+          </w:tcPr>
+          <w:p>
+            <w:pPr>
+              <w:jc w:val="center"/>
+            </w:pPr>
+            <w:r/>
+            <w:r>
+              <w:rPr>
+                <w:sz w:val="20"/>
+              </w:rPr>
+              <w:t>0.62</w:t>
+            </w:r>
+          </w:p>
+        </w:tc>
+        <w:tc>
+          <w:tcPr>
+            <w:tcW w:type="dxa" w:w="1140"/>
+          </w:tcPr>
+          <w:p>
+            <w:pPr>
+              <w:jc w:val="center"/>
+            </w:pPr>
+            <w:r/>
+            <w:r>
+              <w:rPr>
+                <w:sz w:val="20"/>
+              </w:rPr>
+              <w:t>1.02</w:t>
+            </w:r>
+          </w:p>
+        </w:tc>
+        <w:tc>
+          <w:tcPr>
+            <w:tcW w:type="dxa" w:w="2660"/>
+          </w:tcPr>
+          <w:p>
+            <w:pPr>
+              <w:jc w:val="center"/>
+            </w:pPr>
+            <w:r/>
+            <w:r>
+              <w:rPr>
+                <w:sz w:val="20"/>
+              </w:rPr>
+              <w:t>331412 / 331490 (compartida)</w:t>
+            </w:r>
+          </w:p>
+        </w:tc>
+      </w:tr>
+      <w:tr>
+        <w:tc>
+          <w:tcPr>
+            <w:tcW w:type="dxa" w:w="1560"/>
+          </w:tcPr>
+          <w:p>
+            <w:pPr>
+              <w:jc w:val="left"/>
+            </w:pPr>
+            <w:r/>
+            <w:r>
+              <w:rPr>
+                <w:sz w:val="20"/>
+              </w:rPr>
+              <w:t>Plomo-zinc</w:t>
+            </w:r>
+          </w:p>
+        </w:tc>
+        <w:tc>
+          <w:tcPr>
+            <w:tcW w:type="dxa" w:w="1140"/>
+          </w:tcPr>
+          <w:p>
+            <w:pPr>
+              <w:jc w:val="center"/>
+            </w:pPr>
+            <w:r/>
+            <w:r>
+              <w:rPr>
+                <w:sz w:val="20"/>
+              </w:rPr>
+              <w:t>0.71</w:t>
+            </w:r>
+          </w:p>
+        </w:tc>
+        <w:tc>
+          <w:tcPr>
+            <w:tcW w:type="dxa" w:w="1140"/>
+          </w:tcPr>
+          <w:p>
+            <w:pPr>
+              <w:jc w:val="center"/>
+            </w:pPr>
+            <w:r/>
+            <w:r>
+              <w:rPr>
+                <w:sz w:val="20"/>
+              </w:rPr>
+              <w:t>0.63</w:t>
+            </w:r>
+          </w:p>
+        </w:tc>
+        <w:tc>
+          <w:tcPr>
+            <w:tcW w:type="dxa" w:w="1140"/>
+          </w:tcPr>
+          <w:p>
+            <w:pPr>
+              <w:jc w:val="center"/>
+            </w:pPr>
+            <w:r/>
+            <w:r>
+              <w:rPr>
+                <w:sz w:val="20"/>
+              </w:rPr>
+              <w:t>1.02</w:t>
+            </w:r>
+          </w:p>
+        </w:tc>
+        <w:tc>
+          <w:tcPr>
+            <w:tcW w:type="dxa" w:w="2660"/>
+          </w:tcPr>
+          <w:p>
+            <w:pPr>
+              <w:jc w:val="center"/>
+            </w:pPr>
+            <w:r/>
+            <w:r>
+              <w:rPr>
+                <w:sz w:val="20"/>
+              </w:rPr>
+              <w:t>331419 / 331490 (compartida)</w:t>
+            </w:r>
+          </w:p>
+        </w:tc>
+      </w:tr>
+      <w:tr>
+        <w:tc>
+          <w:tcPr>
+            <w:tcW w:type="dxa" w:w="1560"/>
+          </w:tcPr>
+          <w:p>
+            <w:pPr>
+              <w:jc w:val="left"/>
+            </w:pPr>
+            <w:r/>
+            <w:r>
+              <w:rPr>
+                <w:sz w:val="20"/>
+              </w:rPr>
+              <w:t>Manganeso</w:t>
+            </w:r>
+          </w:p>
+        </w:tc>
+        <w:tc>
+          <w:tcPr>
+            <w:tcW w:type="dxa" w:w="1140"/>
+          </w:tcPr>
+          <w:p>
+            <w:pPr>
+              <w:jc w:val="center"/>
+            </w:pPr>
+            <w:r/>
+            <w:r>
+              <w:rPr>
+                <w:sz w:val="20"/>
+              </w:rPr>
+              <w:t>1.54</w:t>
+            </w:r>
+          </w:p>
+        </w:tc>
+        <w:tc>
+          <w:tcPr>
+            <w:tcW w:type="dxa" w:w="1140"/>
+          </w:tcPr>
+          <w:p>
+            <w:pPr>
+              <w:jc w:val="center"/>
+            </w:pPr>
+            <w:r/>
+            <w:r>
+              <w:rPr>
+                <w:sz w:val="20"/>
+              </w:rPr>
+              <w:t>1.34</w:t>
+            </w:r>
+          </w:p>
+        </w:tc>
+        <w:tc>
+          <w:tcPr>
+            <w:tcW w:type="dxa" w:w="1140"/>
+          </w:tcPr>
+          <w:p>
+            <w:pPr>
+              <w:jc w:val="center"/>
+            </w:pPr>
+            <w:r/>
+            <w:r>
+              <w:rPr>
+                <w:sz w:val="20"/>
+              </w:rPr>
+              <w:t>—</w:t>
+            </w:r>
+          </w:p>
+        </w:tc>
+        <w:tc>
+          <w:tcPr>
+            <w:tcW w:type="dxa" w:w="2660"/>
+          </w:tcPr>
+          <w:p>
+            <w:pPr>
+              <w:jc w:val="center"/>
+            </w:pPr>
+            <w:r/>
+            <w:r>
+              <w:rPr>
+                <w:sz w:val="20"/>
+              </w:rPr>
+              <w:t>331112 ferroaleaciones (comp. con acero)</w:t>
+            </w:r>
+          </w:p>
+        </w:tc>
+      </w:tr>
+      <w:tr>
+        <w:tc>
+          <w:tcPr>
+            <w:tcW w:type="dxa" w:w="1560"/>
+          </w:tcPr>
+          <w:p>
+            <w:pPr>
+              <w:jc w:val="left"/>
+            </w:pPr>
+            <w:r/>
+            <w:r>
+              <w:rPr>
+                <w:sz w:val="20"/>
+              </w:rPr>
+              <w:t>Fluorita</w:t>
+            </w:r>
+          </w:p>
+        </w:tc>
+        <w:tc>
+          <w:tcPr>
+            <w:tcW w:type="dxa" w:w="1140"/>
+          </w:tcPr>
+          <w:p>
+            <w:pPr>
+              <w:jc w:val="center"/>
+            </w:pPr>
+            <w:r/>
+            <w:r>
+              <w:rPr>
+                <w:sz w:val="20"/>
+              </w:rPr>
+              <w:t>1.31</w:t>
+            </w:r>
+          </w:p>
+        </w:tc>
+        <w:tc>
+          <w:tcPr>
+            <w:tcW w:type="dxa" w:w="1140"/>
+          </w:tcPr>
+          <w:p>
+            <w:pPr>
+              <w:jc w:val="center"/>
+            </w:pPr>
+            <w:r/>
+            <w:r>
+              <w:rPr>
+                <w:sz w:val="20"/>
+              </w:rPr>
+              <w:t>1.44*</w:t>
+            </w:r>
+          </w:p>
+        </w:tc>
+        <w:tc>
+          <w:tcPr>
+            <w:tcW w:type="dxa" w:w="1140"/>
+          </w:tcPr>
+          <w:p>
+            <w:pPr>
+              <w:jc w:val="center"/>
+            </w:pPr>
+            <w:r/>
+            <w:r>
+              <w:rPr>
+                <w:sz w:val="20"/>
+              </w:rPr>
+              <w:t>1.31</w:t>
+            </w:r>
+          </w:p>
+        </w:tc>
+        <w:tc>
+          <w:tcPr>
+            <w:tcW w:type="dxa" w:w="2660"/>
+          </w:tcPr>
+          <w:p>
+            <w:pPr>
+              <w:jc w:val="center"/>
+            </w:pPr>
+            <w:r/>
+            <w:r>
+              <w:rPr>
+                <w:sz w:val="20"/>
+              </w:rPr>
+              <w:t>325180 / 325211 (agregado)</w:t>
+            </w:r>
+          </w:p>
+        </w:tc>
+      </w:tr>
+      <w:tr>
+        <w:tc>
+          <w:tcPr>
+            <w:tcW w:type="dxa" w:w="1560"/>
+          </w:tcPr>
+          <w:p>
+            <w:pPr>
+              <w:jc w:val="left"/>
+            </w:pPr>
+            <w:r/>
+            <w:r>
+              <w:rPr>
+                <w:sz w:val="20"/>
+              </w:rPr>
+              <w:t>Grafito</w:t>
+            </w:r>
+          </w:p>
+        </w:tc>
+        <w:tc>
+          <w:tcPr>
+            <w:tcW w:type="dxa" w:w="1140"/>
+          </w:tcPr>
+          <w:p>
+            <w:pPr>
+              <w:jc w:val="center"/>
+            </w:pPr>
+            <w:r/>
+            <w:r>
+              <w:rPr>
+                <w:sz w:val="20"/>
+              </w:rPr>
+              <w:t>1.71</w:t>
+            </w:r>
+          </w:p>
+        </w:tc>
+        <w:tc>
+          <w:tcPr>
+            <w:tcW w:type="dxa" w:w="1140"/>
+          </w:tcPr>
+          <w:p>
+            <w:pPr>
+              <w:jc w:val="center"/>
+            </w:pPr>
+            <w:r/>
+            <w:r>
+              <w:rPr>
+                <w:sz w:val="20"/>
+              </w:rPr>
+              <w:t>1.44*</w:t>
+            </w:r>
+          </w:p>
+        </w:tc>
+        <w:tc>
+          <w:tcPr>
+            <w:tcW w:type="dxa" w:w="1140"/>
+          </w:tcPr>
+          <w:p>
+            <w:pPr>
+              <w:jc w:val="center"/>
+            </w:pPr>
+            <w:r/>
+            <w:r>
+              <w:rPr>
+                <w:sz w:val="20"/>
+              </w:rPr>
+              <w:t>1.24</w:t>
+            </w:r>
+          </w:p>
+        </w:tc>
+        <w:tc>
+          <w:tcPr>
+            <w:tcW w:type="dxa" w:w="2660"/>
+          </w:tcPr>
+          <w:p>
+            <w:pPr>
+              <w:jc w:val="center"/>
+            </w:pPr>
+            <w:r/>
+            <w:r>
+              <w:rPr>
+                <w:sz w:val="20"/>
+              </w:rPr>
+              <w:t>325180 / 327999 (agregado)</w:t>
+            </w:r>
+          </w:p>
+        </w:tc>
+      </w:tr>
+      <w:tr>
+        <w:tc>
+          <w:tcPr>
+            <w:tcW w:type="dxa" w:w="1560"/>
+          </w:tcPr>
+          <w:p>
+            <w:pPr>
+              <w:jc w:val="left"/>
+            </w:pPr>
+            <w:r/>
+            <w:r>
+              <w:rPr>
+                <w:sz w:val="20"/>
+              </w:rPr>
+              <w:t>Sílice</w:t>
+            </w:r>
+          </w:p>
+        </w:tc>
+        <w:tc>
+          <w:tcPr>
+            <w:tcW w:type="dxa" w:w="1140"/>
+          </w:tcPr>
+          <w:p>
+            <w:pPr>
+              <w:jc w:val="center"/>
+            </w:pPr>
+            <w:r/>
+            <w:r>
+              <w:rPr>
+                <w:sz w:val="20"/>
+              </w:rPr>
+              <w:t>1.92</w:t>
+            </w:r>
+          </w:p>
+        </w:tc>
+        <w:tc>
+          <w:tcPr>
+            <w:tcW w:type="dxa" w:w="1140"/>
+          </w:tcPr>
+          <w:p>
+            <w:pPr>
+              <w:jc w:val="center"/>
+            </w:pPr>
+            <w:r/>
+            <w:r>
+              <w:rPr>
+                <w:sz w:val="20"/>
+              </w:rPr>
+              <w:t>1.44*</w:t>
+            </w:r>
+          </w:p>
+        </w:tc>
+        <w:tc>
+          <w:tcPr>
+            <w:tcW w:type="dxa" w:w="1140"/>
+          </w:tcPr>
+          <w:p>
+            <w:pPr>
+              <w:jc w:val="center"/>
+            </w:pPr>
+            <w:r/>
+            <w:r>
+              <w:rPr>
+                <w:sz w:val="20"/>
+              </w:rPr>
+              <w:t>1.34</w:t>
+            </w:r>
+          </w:p>
+        </w:tc>
+        <w:tc>
+          <w:tcPr>
+            <w:tcW w:type="dxa" w:w="2660"/>
+          </w:tcPr>
+          <w:p>
+            <w:pPr>
+              <w:jc w:val="center"/>
+            </w:pPr>
+            <w:r/>
+            <w:r>
+              <w:rPr>
+                <w:sz w:val="20"/>
+              </w:rPr>
+              <w:t>325180 / 327211 (agregado)</w:t>
+            </w:r>
+          </w:p>
+        </w:tc>
+      </w:tr>
+      <w:tr>
+        <w:tc>
+          <w:tcPr>
+            <w:tcW w:type="dxa" w:w="1560"/>
+          </w:tcPr>
+          <w:p>
+            <w:pPr>
+              <w:jc w:val="left"/>
+            </w:pPr>
+            <w:r/>
+            <w:r>
+              <w:rPr>
+                <w:sz w:val="20"/>
+              </w:rPr>
+              <w:t>Barita</w:t>
+            </w:r>
+          </w:p>
+        </w:tc>
+        <w:tc>
+          <w:tcPr>
+            <w:tcW w:type="dxa" w:w="1140"/>
+          </w:tcPr>
+          <w:p>
+            <w:pPr>
+              <w:jc w:val="center"/>
+            </w:pPr>
+            <w:r/>
+            <w:r>
+              <w:rPr>
+                <w:sz w:val="20"/>
+              </w:rPr>
+              <w:t>0.64</w:t>
+            </w:r>
+          </w:p>
+        </w:tc>
+        <w:tc>
+          <w:tcPr>
+            <w:tcW w:type="dxa" w:w="1140"/>
+          </w:tcPr>
+          <w:p>
+            <w:pPr>
+              <w:jc w:val="center"/>
+            </w:pPr>
+            <w:r/>
+            <w:r>
+              <w:rPr>
+                <w:sz w:val="20"/>
+              </w:rPr>
+              <w:t>1.44*</w:t>
+            </w:r>
+          </w:p>
+        </w:tc>
+        <w:tc>
+          <w:tcPr>
+            <w:tcW w:type="dxa" w:w="1140"/>
+          </w:tcPr>
+          <w:p>
+            <w:pPr>
+              <w:jc w:val="center"/>
+            </w:pPr>
+            <w:r/>
+            <w:r>
+              <w:rPr>
+                <w:sz w:val="20"/>
+              </w:rPr>
+              <w:t>—</w:t>
+            </w:r>
+          </w:p>
+        </w:tc>
+        <w:tc>
+          <w:tcPr>
+            <w:tcW w:type="dxa" w:w="2660"/>
+          </w:tcPr>
+          <w:p>
+            <w:pPr>
+              <w:jc w:val="center"/>
+            </w:pPr>
+            <w:r/>
+            <w:r>
+              <w:rPr>
+                <w:sz w:val="20"/>
+              </w:rPr>
+              <w:t>325180 (agregado)</w:t>
+            </w:r>
+          </w:p>
+        </w:tc>
+      </w:tr>
+    </w:tbl>
+    <w:p>
+      <w:pPr>
+        <w:spacing w:before="60" w:after="160"/>
+      </w:pPr>
+      <w:r>
+        <w:rPr>
+          <w:i/>
+          <w:sz w:val="18"/>
+        </w:rPr>
+        <w:t>Cuadro V.4bis. Índice de Ghosh hacia adelante (Rasmussen, media=1) por eslabón, corte 2018. * clase agregada de químicos, no atribuible al mineral. Cortes 2008 y 2013 en processed/mip_encadenamientos_eslabones.csv (script mip_eslabones.py).</w:t>
+      </w:r>
+    </w:p>
+    <w:p>
+      <w:pPr>
+        <w:spacing w:after="120" w:line="276" w:lineRule="auto"/>
+        <w:jc w:val="both"/>
+      </w:pPr>
+      <w:r>
+        <w:t xml:space="preserve">El caso del </w:t>
+      </w:r>
+      <w:r>
+        <w:rPr>
+          <w:b/>
+          <w:i w:val="0"/>
+        </w:rPr>
+        <w:t>cobre</w:t>
+      </w:r>
+      <w:r>
+        <w:t xml:space="preserve"> es ilustrativo: la refinación (1.37) supera incluso a la extracción, porque la fundición sí alimenta industria doméstica; pero la </w:t>
+      </w:r>
+      <w:r>
+        <w:rPr>
+          <w:b/>
+          <w:i w:val="0"/>
+        </w:rPr>
+        <w:t>semimanufactura cae a 0.95</w:t>
+      </w:r>
+      <w:r>
+        <w:t xml:space="preserve">, justo donde se agregaría más valor. En los </w:t>
+      </w:r>
+      <w:r>
+        <w:rPr>
+          <w:b/>
+          <w:i w:val="0"/>
+        </w:rPr>
+        <w:t>metales preciosos</w:t>
+      </w:r>
+      <w:r>
+        <w:t xml:space="preserve"> el corte es más agudo: la refinación (331412) tiene un Ghosh de </w:t>
+      </w:r>
+      <w:r>
+        <w:rPr>
+          <w:b/>
+          <w:i w:val="0"/>
+        </w:rPr>
+        <w:t>0.62</w:t>
+      </w:r>
+      <w:r>
+        <w:t xml:space="preserve">, de los más bajos de la economía, porque el metal refinado no alimenta industria nacional sino que se exporta como lingote —el enclave estructural aparece en el propio índice, sin necesidad de otro indicador—. Sólo el </w:t>
+      </w:r>
+      <w:r>
+        <w:rPr>
+          <w:b w:val="0"/>
+          <w:i/>
+        </w:rPr>
+        <w:t>manganeso</w:t>
+      </w:r>
+      <w:r>
+        <w:t xml:space="preserve"> sostiene el arrastre hasta la ferroaleación (1.34), coherente con su cadena local (Autlán). En los no metálicos, el eslabón aguas abajo cae en una clase agregada de químicos (325180), no separable por mineral. El mismo ejercicio a nivel </w:t>
+      </w:r>
+      <w:r>
+        <w:rPr>
+          <w:b/>
+          <w:i w:val="0"/>
+        </w:rPr>
+        <w:t>estatal e internacional</w:t>
+      </w:r>
+      <w:r>
+        <w:t xml:space="preserve"> se recoge en el Cap. VII y en la memoria de encadenamientos por eslabón.</w:t>
+      </w:r>
+    </w:p>
+    <w:p>
+      <w:pPr>
+        <w:spacing w:before="240" w:after="120"/>
+      </w:pPr>
+      <w:r>
+        <w:rPr>
+          <w:b/>
+          <w:color w:val="1A1A1A"/>
+          <w:sz w:val="26"/>
+        </w:rPr>
         <w:t>V.11  El coeficiente de captura de valor (CCV): una serie continua del encadenamiento hacia adelante</w:t>
       </w:r>
     </w:p>

</xml_diff>